<commit_message>
output text file added.
</commit_message>
<xml_diff>
--- a/contribution_table.docx
+++ b/contribution_table.docx
@@ -5,14 +5,19 @@
     <w:p>
       <w:pPr>
         <w:spacing w:after="120"/>
+        <w:rPr>
+          <w:rFonts w:ascii="Arial" w:hAnsi="Arial" w:cs="Arial"/>
+          <w:sz w:val="22"/>
+          <w:szCs w:val="22"/>
+        </w:rPr>
       </w:pPr>
       <w:r>
         <w:rPr>
           <w:rFonts w:ascii="Arial" w:eastAsia="Arial" w:hAnsi="Arial" w:cs="Arial"/>
           <w:b/>
           <w:bCs/>
-          <w:sz w:val="30"/>
-          <w:szCs w:val="30"/>
+          <w:sz w:val="22"/>
+          <w:szCs w:val="22"/>
         </w:rPr>
         <w:t>Group Contribution and Peer Evaluation</w:t>
       </w:r>
@@ -20,6 +25,11 @@
     <w:p>
       <w:pPr>
         <w:spacing w:after="200"/>
+        <w:rPr>
+          <w:rFonts w:ascii="Arial" w:eastAsia="Arial" w:hAnsi="Arial" w:cs="Arial"/>
+          <w:sz w:val="22"/>
+          <w:szCs w:val="22"/>
+        </w:rPr>
       </w:pPr>
       <w:r>
         <w:rPr>
@@ -28,6 +38,24 @@
           <w:szCs w:val="22"/>
         </w:rPr>
         <w:t>Program: Gas and Oil Purchase Calculator</w:t>
+      </w:r>
+    </w:p>
+    <w:p>
+      <w:pPr>
+        <w:spacing w:after="200"/>
+        <w:rPr>
+          <w:rFonts w:ascii="Arial" w:eastAsia="Arial" w:hAnsi="Arial" w:cs="Arial"/>
+          <w:sz w:val="22"/>
+          <w:szCs w:val="22"/>
+        </w:rPr>
+      </w:pPr>
+      <w:r>
+        <w:rPr>
+          <w:rFonts w:ascii="Arial" w:eastAsia="Arial" w:hAnsi="Arial" w:cs="Arial"/>
+          <w:sz w:val="22"/>
+          <w:szCs w:val="22"/>
+        </w:rPr>
+        <w:t>Group: Group 4</w:t>
       </w:r>
     </w:p>
     <w:tbl>
@@ -57,12 +85,6 @@
         <w:gridCol w:w="4180"/>
       </w:tblGrid>
       <w:tr>
-        <w:tblPrEx>
-          <w:tblCellMar>
-            <w:top w:w="0" w:type="dxa"/>
-            <w:bottom w:w="0" w:type="dxa"/>
-          </w:tblCellMar>
-        </w:tblPrEx>
         <w:trPr>
           <w:tblHeader/>
         </w:trPr>
@@ -87,6 +109,11 @@
           <w:p>
             <w:pPr>
               <w:jc w:val="center"/>
+              <w:rPr>
+                <w:rFonts w:ascii="Arial" w:hAnsi="Arial" w:cs="Arial"/>
+                <w:sz w:val="22"/>
+                <w:szCs w:val="22"/>
+              </w:rPr>
             </w:pPr>
           </w:p>
         </w:tc>
@@ -111,6 +138,11 @@
           <w:p>
             <w:pPr>
               <w:jc w:val="center"/>
+              <w:rPr>
+                <w:rFonts w:ascii="Arial" w:hAnsi="Arial" w:cs="Arial"/>
+                <w:sz w:val="22"/>
+                <w:szCs w:val="22"/>
+              </w:rPr>
             </w:pPr>
             <w:r>
               <w:rPr>
@@ -145,6 +177,11 @@
           <w:p>
             <w:pPr>
               <w:jc w:val="center"/>
+              <w:rPr>
+                <w:rFonts w:ascii="Arial" w:hAnsi="Arial" w:cs="Arial"/>
+                <w:sz w:val="22"/>
+                <w:szCs w:val="22"/>
+              </w:rPr>
             </w:pPr>
             <w:r>
               <w:rPr>
@@ -189,6 +226,11 @@
           <w:p>
             <w:pPr>
               <w:jc w:val="center"/>
+              <w:rPr>
+                <w:rFonts w:ascii="Arial" w:hAnsi="Arial" w:cs="Arial"/>
+                <w:sz w:val="22"/>
+                <w:szCs w:val="22"/>
+              </w:rPr>
             </w:pPr>
             <w:r>
               <w:rPr>
@@ -223,6 +265,11 @@
           <w:p>
             <w:pPr>
               <w:jc w:val="center"/>
+              <w:rPr>
+                <w:rFonts w:ascii="Arial" w:hAnsi="Arial" w:cs="Arial"/>
+                <w:sz w:val="22"/>
+                <w:szCs w:val="22"/>
+              </w:rPr>
             </w:pPr>
             <w:r>
               <w:rPr>
@@ -257,6 +304,11 @@
           <w:p>
             <w:pPr>
               <w:jc w:val="center"/>
+              <w:rPr>
+                <w:rFonts w:ascii="Arial" w:hAnsi="Arial" w:cs="Arial"/>
+                <w:sz w:val="22"/>
+                <w:szCs w:val="22"/>
+              </w:rPr>
             </w:pPr>
             <w:r>
               <w:rPr>
@@ -291,6 +343,11 @@
           <w:p>
             <w:pPr>
               <w:jc w:val="center"/>
+              <w:rPr>
+                <w:rFonts w:ascii="Arial" w:hAnsi="Arial" w:cs="Arial"/>
+                <w:sz w:val="22"/>
+                <w:szCs w:val="22"/>
+              </w:rPr>
             </w:pPr>
             <w:r>
               <w:rPr>
@@ -306,12 +363,6 @@
         </w:tc>
       </w:tr>
       <w:tr>
-        <w:tblPrEx>
-          <w:tblCellMar>
-            <w:top w:w="0" w:type="dxa"/>
-            <w:bottom w:w="0" w:type="dxa"/>
-          </w:tblCellMar>
-        </w:tblPrEx>
         <w:tc>
           <w:tcPr>
             <w:tcW w:w="2000" w:type="dxa"/>
@@ -333,6 +384,11 @@
           <w:p>
             <w:pPr>
               <w:jc w:val="center"/>
+              <w:rPr>
+                <w:rFonts w:ascii="Arial" w:hAnsi="Arial" w:cs="Arial"/>
+                <w:sz w:val="22"/>
+                <w:szCs w:val="22"/>
+              </w:rPr>
             </w:pPr>
             <w:r>
               <w:rPr>
@@ -366,6 +422,11 @@
           <w:p>
             <w:pPr>
               <w:jc w:val="center"/>
+              <w:rPr>
+                <w:rFonts w:ascii="Arial" w:hAnsi="Arial" w:cs="Arial"/>
+                <w:sz w:val="22"/>
+                <w:szCs w:val="22"/>
+              </w:rPr>
             </w:pPr>
             <w:r>
               <w:rPr>
@@ -397,76 +458,128 @@
           <w:p>
             <w:pPr>
               <w:jc w:val="center"/>
-            </w:pPr>
-          </w:p>
-        </w:tc>
-        <w:tc>
-          <w:tcPr>
-            <w:tcW w:w="1500" w:type="dxa"/>
-            <w:tcBorders>
-              <w:top w:val="single" w:sz="6" w:space="0" w:color="000000"/>
-              <w:left w:val="single" w:sz="6" w:space="0" w:color="000000"/>
-              <w:bottom w:val="single" w:sz="6" w:space="0" w:color="000000"/>
-              <w:right w:val="single" w:sz="6" w:space="0" w:color="000000"/>
-            </w:tcBorders>
-            <w:tcMar>
-              <w:top w:w="80" w:type="dxa"/>
-              <w:left w:w="100" w:type="dxa"/>
-              <w:bottom w:w="80" w:type="dxa"/>
-              <w:right w:w="100" w:type="dxa"/>
-            </w:tcMar>
-            <w:vAlign w:val="center"/>
-          </w:tcPr>
-          <w:p>
-            <w:pPr>
-              <w:jc w:val="center"/>
-            </w:pPr>
-          </w:p>
-        </w:tc>
-        <w:tc>
-          <w:tcPr>
-            <w:tcW w:w="1500" w:type="dxa"/>
-            <w:tcBorders>
-              <w:top w:val="single" w:sz="6" w:space="0" w:color="000000"/>
-              <w:left w:val="single" w:sz="6" w:space="0" w:color="000000"/>
-              <w:bottom w:val="single" w:sz="6" w:space="0" w:color="000000"/>
-              <w:right w:val="single" w:sz="6" w:space="0" w:color="000000"/>
-            </w:tcBorders>
-            <w:tcMar>
-              <w:top w:w="80" w:type="dxa"/>
-              <w:left w:w="100" w:type="dxa"/>
-              <w:bottom w:w="80" w:type="dxa"/>
-              <w:right w:w="100" w:type="dxa"/>
-            </w:tcMar>
-            <w:vAlign w:val="center"/>
-          </w:tcPr>
-          <w:p>
-            <w:pPr>
-              <w:jc w:val="center"/>
-            </w:pPr>
-          </w:p>
-        </w:tc>
-        <w:tc>
-          <w:tcPr>
-            <w:tcW w:w="1500" w:type="dxa"/>
-            <w:tcBorders>
-              <w:top w:val="single" w:sz="6" w:space="0" w:color="000000"/>
-              <w:left w:val="single" w:sz="6" w:space="0" w:color="000000"/>
-              <w:bottom w:val="single" w:sz="6" w:space="0" w:color="000000"/>
-              <w:right w:val="single" w:sz="6" w:space="0" w:color="000000"/>
-            </w:tcBorders>
-            <w:tcMar>
-              <w:top w:w="80" w:type="dxa"/>
-              <w:left w:w="100" w:type="dxa"/>
-              <w:bottom w:w="80" w:type="dxa"/>
-              <w:right w:w="100" w:type="dxa"/>
-            </w:tcMar>
-            <w:vAlign w:val="center"/>
-          </w:tcPr>
-          <w:p>
-            <w:pPr>
-              <w:jc w:val="center"/>
-            </w:pPr>
+              <w:rPr>
+                <w:rFonts w:ascii="Arial" w:hAnsi="Arial" w:cs="Arial"/>
+                <w:sz w:val="22"/>
+                <w:szCs w:val="22"/>
+              </w:rPr>
+            </w:pPr>
+            <w:r>
+              <w:rPr>
+                <w:rFonts w:ascii="Arial" w:hAnsi="Arial" w:cs="Arial"/>
+                <w:sz w:val="22"/>
+                <w:szCs w:val="22"/>
+              </w:rPr>
+              <w:t>10</w:t>
+            </w:r>
+          </w:p>
+        </w:tc>
+        <w:tc>
+          <w:tcPr>
+            <w:tcW w:w="1500" w:type="dxa"/>
+            <w:tcBorders>
+              <w:top w:val="single" w:sz="6" w:space="0" w:color="000000"/>
+              <w:left w:val="single" w:sz="6" w:space="0" w:color="000000"/>
+              <w:bottom w:val="single" w:sz="6" w:space="0" w:color="000000"/>
+              <w:right w:val="single" w:sz="6" w:space="0" w:color="000000"/>
+            </w:tcBorders>
+            <w:tcMar>
+              <w:top w:w="80" w:type="dxa"/>
+              <w:left w:w="100" w:type="dxa"/>
+              <w:bottom w:w="80" w:type="dxa"/>
+              <w:right w:w="100" w:type="dxa"/>
+            </w:tcMar>
+            <w:vAlign w:val="center"/>
+          </w:tcPr>
+          <w:p>
+            <w:pPr>
+              <w:jc w:val="center"/>
+              <w:rPr>
+                <w:rFonts w:ascii="Arial" w:hAnsi="Arial" w:cs="Arial"/>
+                <w:sz w:val="22"/>
+                <w:szCs w:val="22"/>
+              </w:rPr>
+            </w:pPr>
+            <w:r>
+              <w:rPr>
+                <w:rFonts w:ascii="Arial" w:hAnsi="Arial" w:cs="Arial"/>
+                <w:sz w:val="22"/>
+                <w:szCs w:val="22"/>
+              </w:rPr>
+              <w:t>10</w:t>
+            </w:r>
+          </w:p>
+        </w:tc>
+        <w:tc>
+          <w:tcPr>
+            <w:tcW w:w="1500" w:type="dxa"/>
+            <w:tcBorders>
+              <w:top w:val="single" w:sz="6" w:space="0" w:color="000000"/>
+              <w:left w:val="single" w:sz="6" w:space="0" w:color="000000"/>
+              <w:bottom w:val="single" w:sz="6" w:space="0" w:color="000000"/>
+              <w:right w:val="single" w:sz="6" w:space="0" w:color="000000"/>
+            </w:tcBorders>
+            <w:tcMar>
+              <w:top w:w="80" w:type="dxa"/>
+              <w:left w:w="100" w:type="dxa"/>
+              <w:bottom w:w="80" w:type="dxa"/>
+              <w:right w:w="100" w:type="dxa"/>
+            </w:tcMar>
+            <w:vAlign w:val="center"/>
+          </w:tcPr>
+          <w:p>
+            <w:pPr>
+              <w:jc w:val="center"/>
+              <w:rPr>
+                <w:rFonts w:ascii="Arial" w:hAnsi="Arial" w:cs="Arial"/>
+                <w:sz w:val="22"/>
+                <w:szCs w:val="22"/>
+              </w:rPr>
+            </w:pPr>
+            <w:r>
+              <w:rPr>
+                <w:rFonts w:ascii="Arial" w:hAnsi="Arial" w:cs="Arial"/>
+                <w:sz w:val="22"/>
+                <w:szCs w:val="22"/>
+              </w:rPr>
+              <w:t>10</w:t>
+            </w:r>
+          </w:p>
+        </w:tc>
+        <w:tc>
+          <w:tcPr>
+            <w:tcW w:w="1500" w:type="dxa"/>
+            <w:tcBorders>
+              <w:top w:val="single" w:sz="6" w:space="0" w:color="000000"/>
+              <w:left w:val="single" w:sz="6" w:space="0" w:color="000000"/>
+              <w:bottom w:val="single" w:sz="6" w:space="0" w:color="000000"/>
+              <w:right w:val="single" w:sz="6" w:space="0" w:color="000000"/>
+            </w:tcBorders>
+            <w:tcMar>
+              <w:top w:w="80" w:type="dxa"/>
+              <w:left w:w="100" w:type="dxa"/>
+              <w:bottom w:w="80" w:type="dxa"/>
+              <w:right w:w="100" w:type="dxa"/>
+            </w:tcMar>
+            <w:vAlign w:val="center"/>
+          </w:tcPr>
+          <w:p>
+            <w:pPr>
+              <w:jc w:val="center"/>
+              <w:rPr>
+                <w:rFonts w:ascii="Arial" w:hAnsi="Arial" w:cs="Arial"/>
+                <w:sz w:val="22"/>
+                <w:szCs w:val="22"/>
+              </w:rPr>
+            </w:pPr>
+            <w:r>
+              <w:rPr>
+                <w:rFonts w:ascii="Arial" w:hAnsi="Arial" w:cs="Arial"/>
+                <w:sz w:val="22"/>
+                <w:szCs w:val="22"/>
+              </w:rPr>
+              <w:t>10</w:t>
+            </w:r>
           </w:p>
         </w:tc>
         <w:tc>
@@ -493,6 +606,11 @@
                 <w:ilvl w:val="0"/>
                 <w:numId w:val="2"/>
               </w:numPr>
+              <w:rPr>
+                <w:rFonts w:ascii="Arial" w:hAnsi="Arial" w:cs="Arial"/>
+                <w:sz w:val="22"/>
+                <w:szCs w:val="22"/>
+              </w:rPr>
             </w:pPr>
             <w:r>
               <w:rPr>
@@ -500,7 +618,39 @@
                 <w:sz w:val="22"/>
                 <w:szCs w:val="22"/>
               </w:rPr>
-              <w:t>Wrote the first full version of the program</w:t>
+              <w:t>W</w:t>
+            </w:r>
+            <w:r>
+              <w:rPr>
+                <w:rFonts w:ascii="Arial" w:eastAsia="Arial" w:hAnsi="Arial" w:cs="Arial"/>
+                <w:sz w:val="22"/>
+                <w:szCs w:val="22"/>
+              </w:rPr>
+              <w:t xml:space="preserve">orked on </w:t>
+            </w:r>
+            <w:r>
+              <w:rPr>
+                <w:rFonts w:ascii="Arial" w:eastAsia="Arial" w:hAnsi="Arial" w:cs="Arial"/>
+                <w:sz w:val="22"/>
+                <w:szCs w:val="22"/>
+              </w:rPr>
+              <w:t>both the oil</w:t>
+            </w:r>
+            <w:r>
+              <w:rPr>
+                <w:rFonts w:ascii="Arial" w:eastAsia="Arial" w:hAnsi="Arial" w:cs="Arial"/>
+                <w:sz w:val="22"/>
+                <w:szCs w:val="22"/>
+              </w:rPr>
+              <w:t xml:space="preserve"> and gas branches</w:t>
+            </w:r>
+            <w:r>
+              <w:rPr>
+                <w:rFonts w:ascii="Arial" w:eastAsia="Arial" w:hAnsi="Arial" w:cs="Arial"/>
+                <w:sz w:val="22"/>
+                <w:szCs w:val="22"/>
+              </w:rPr>
+              <w:t xml:space="preserve"> of the code</w:t>
             </w:r>
           </w:p>
           <w:p>
@@ -510,25 +660,40 @@
                 <w:ilvl w:val="0"/>
                 <w:numId w:val="2"/>
               </w:numPr>
-            </w:pPr>
-            <w:r>
-              <w:rPr>
-                <w:rFonts w:ascii="Arial" w:eastAsia="Arial" w:hAnsi="Arial" w:cs="Arial"/>
-                <w:sz w:val="22"/>
-                <w:szCs w:val="22"/>
-              </w:rPr>
-              <w:t>Worked on the oil branch</w:t>
+              <w:rPr>
+                <w:rFonts w:ascii="Arial" w:hAnsi="Arial" w:cs="Arial"/>
+                <w:sz w:val="22"/>
+                <w:szCs w:val="22"/>
+              </w:rPr>
+            </w:pPr>
+            <w:r>
+              <w:rPr>
+                <w:rFonts w:ascii="Arial" w:hAnsi="Arial" w:cs="Arial"/>
+                <w:sz w:val="22"/>
+                <w:szCs w:val="22"/>
+              </w:rPr>
+              <w:t>Sanitized</w:t>
+            </w:r>
+            <w:r>
+              <w:rPr>
+                <w:rFonts w:ascii="Arial" w:hAnsi="Arial" w:cs="Arial"/>
+                <w:sz w:val="22"/>
+                <w:szCs w:val="22"/>
+              </w:rPr>
+              <w:t xml:space="preserve"> the input</w:t>
+            </w:r>
+            <w:r>
+              <w:rPr>
+                <w:rFonts w:ascii="Arial" w:hAnsi="Arial" w:cs="Arial"/>
+                <w:sz w:val="22"/>
+                <w:szCs w:val="22"/>
+              </w:rPr>
+              <w:t>s</w:t>
             </w:r>
           </w:p>
         </w:tc>
       </w:tr>
       <w:tr>
-        <w:tblPrEx>
-          <w:tblCellMar>
-            <w:top w:w="0" w:type="dxa"/>
-            <w:bottom w:w="0" w:type="dxa"/>
-          </w:tblCellMar>
-        </w:tblPrEx>
         <w:tc>
           <w:tcPr>
             <w:tcW w:w="2000" w:type="dxa"/>
@@ -550,6 +715,11 @@
           <w:p>
             <w:pPr>
               <w:jc w:val="center"/>
+              <w:rPr>
+                <w:rFonts w:ascii="Arial" w:hAnsi="Arial" w:cs="Arial"/>
+                <w:sz w:val="22"/>
+                <w:szCs w:val="22"/>
+              </w:rPr>
             </w:pPr>
             <w:r>
               <w:rPr>
@@ -583,29 +753,47 @@
           <w:p>
             <w:pPr>
               <w:jc w:val="center"/>
-            </w:pPr>
-          </w:p>
-        </w:tc>
-        <w:tc>
-          <w:tcPr>
-            <w:tcW w:w="1500" w:type="dxa"/>
-            <w:tcBorders>
-              <w:top w:val="single" w:sz="6" w:space="0" w:color="000000"/>
-              <w:left w:val="single" w:sz="6" w:space="0" w:color="000000"/>
-              <w:bottom w:val="single" w:sz="6" w:space="0" w:color="000000"/>
-              <w:right w:val="single" w:sz="6" w:space="0" w:color="000000"/>
-            </w:tcBorders>
-            <w:tcMar>
-              <w:top w:w="80" w:type="dxa"/>
-              <w:left w:w="100" w:type="dxa"/>
-              <w:bottom w:w="80" w:type="dxa"/>
-              <w:right w:w="100" w:type="dxa"/>
-            </w:tcMar>
-            <w:vAlign w:val="center"/>
-          </w:tcPr>
-          <w:p>
-            <w:pPr>
-              <w:jc w:val="center"/>
+              <w:rPr>
+                <w:rFonts w:ascii="Arial" w:hAnsi="Arial" w:cs="Arial"/>
+                <w:sz w:val="22"/>
+                <w:szCs w:val="22"/>
+              </w:rPr>
+            </w:pPr>
+            <w:r>
+              <w:rPr>
+                <w:rFonts w:ascii="Arial" w:hAnsi="Arial" w:cs="Arial"/>
+                <w:sz w:val="22"/>
+                <w:szCs w:val="22"/>
+              </w:rPr>
+              <w:t>10</w:t>
+            </w:r>
+          </w:p>
+        </w:tc>
+        <w:tc>
+          <w:tcPr>
+            <w:tcW w:w="1500" w:type="dxa"/>
+            <w:tcBorders>
+              <w:top w:val="single" w:sz="6" w:space="0" w:color="000000"/>
+              <w:left w:val="single" w:sz="6" w:space="0" w:color="000000"/>
+              <w:bottom w:val="single" w:sz="6" w:space="0" w:color="000000"/>
+              <w:right w:val="single" w:sz="6" w:space="0" w:color="000000"/>
+            </w:tcBorders>
+            <w:tcMar>
+              <w:top w:w="80" w:type="dxa"/>
+              <w:left w:w="100" w:type="dxa"/>
+              <w:bottom w:w="80" w:type="dxa"/>
+              <w:right w:w="100" w:type="dxa"/>
+            </w:tcMar>
+            <w:vAlign w:val="center"/>
+          </w:tcPr>
+          <w:p>
+            <w:pPr>
+              <w:jc w:val="center"/>
+              <w:rPr>
+                <w:rFonts w:ascii="Arial" w:hAnsi="Arial" w:cs="Arial"/>
+                <w:sz w:val="22"/>
+                <w:szCs w:val="22"/>
+              </w:rPr>
             </w:pPr>
             <w:r>
               <w:rPr>
@@ -637,53 +825,92 @@
           <w:p>
             <w:pPr>
               <w:jc w:val="center"/>
-            </w:pPr>
-          </w:p>
-        </w:tc>
-        <w:tc>
-          <w:tcPr>
-            <w:tcW w:w="1500" w:type="dxa"/>
-            <w:tcBorders>
-              <w:top w:val="single" w:sz="6" w:space="0" w:color="000000"/>
-              <w:left w:val="single" w:sz="6" w:space="0" w:color="000000"/>
-              <w:bottom w:val="single" w:sz="6" w:space="0" w:color="000000"/>
-              <w:right w:val="single" w:sz="6" w:space="0" w:color="000000"/>
-            </w:tcBorders>
-            <w:tcMar>
-              <w:top w:w="80" w:type="dxa"/>
-              <w:left w:w="100" w:type="dxa"/>
-              <w:bottom w:w="80" w:type="dxa"/>
-              <w:right w:w="100" w:type="dxa"/>
-            </w:tcMar>
-            <w:vAlign w:val="center"/>
-          </w:tcPr>
-          <w:p>
-            <w:pPr>
-              <w:jc w:val="center"/>
-            </w:pPr>
-          </w:p>
-        </w:tc>
-        <w:tc>
-          <w:tcPr>
-            <w:tcW w:w="1500" w:type="dxa"/>
-            <w:tcBorders>
-              <w:top w:val="single" w:sz="6" w:space="0" w:color="000000"/>
-              <w:left w:val="single" w:sz="6" w:space="0" w:color="000000"/>
-              <w:bottom w:val="single" w:sz="6" w:space="0" w:color="000000"/>
-              <w:right w:val="single" w:sz="6" w:space="0" w:color="000000"/>
-            </w:tcBorders>
-            <w:tcMar>
-              <w:top w:w="80" w:type="dxa"/>
-              <w:left w:w="100" w:type="dxa"/>
-              <w:bottom w:w="80" w:type="dxa"/>
-              <w:right w:w="100" w:type="dxa"/>
-            </w:tcMar>
-            <w:vAlign w:val="center"/>
-          </w:tcPr>
-          <w:p>
-            <w:pPr>
-              <w:jc w:val="center"/>
-            </w:pPr>
+              <w:rPr>
+                <w:rFonts w:ascii="Arial" w:hAnsi="Arial" w:cs="Arial"/>
+                <w:sz w:val="22"/>
+                <w:szCs w:val="22"/>
+              </w:rPr>
+            </w:pPr>
+            <w:r>
+              <w:rPr>
+                <w:rFonts w:ascii="Arial" w:hAnsi="Arial" w:cs="Arial"/>
+                <w:sz w:val="22"/>
+                <w:szCs w:val="22"/>
+              </w:rPr>
+              <w:t>10</w:t>
+            </w:r>
+          </w:p>
+        </w:tc>
+        <w:tc>
+          <w:tcPr>
+            <w:tcW w:w="1500" w:type="dxa"/>
+            <w:tcBorders>
+              <w:top w:val="single" w:sz="6" w:space="0" w:color="000000"/>
+              <w:left w:val="single" w:sz="6" w:space="0" w:color="000000"/>
+              <w:bottom w:val="single" w:sz="6" w:space="0" w:color="000000"/>
+              <w:right w:val="single" w:sz="6" w:space="0" w:color="000000"/>
+            </w:tcBorders>
+            <w:tcMar>
+              <w:top w:w="80" w:type="dxa"/>
+              <w:left w:w="100" w:type="dxa"/>
+              <w:bottom w:w="80" w:type="dxa"/>
+              <w:right w:w="100" w:type="dxa"/>
+            </w:tcMar>
+            <w:vAlign w:val="center"/>
+          </w:tcPr>
+          <w:p>
+            <w:pPr>
+              <w:jc w:val="center"/>
+              <w:rPr>
+                <w:rFonts w:ascii="Arial" w:hAnsi="Arial" w:cs="Arial"/>
+                <w:sz w:val="22"/>
+                <w:szCs w:val="22"/>
+              </w:rPr>
+            </w:pPr>
+            <w:r>
+              <w:rPr>
+                <w:rFonts w:ascii="Arial" w:hAnsi="Arial" w:cs="Arial"/>
+                <w:sz w:val="22"/>
+                <w:szCs w:val="22"/>
+              </w:rPr>
+              <w:t>10</w:t>
+            </w:r>
+          </w:p>
+        </w:tc>
+        <w:tc>
+          <w:tcPr>
+            <w:tcW w:w="1500" w:type="dxa"/>
+            <w:tcBorders>
+              <w:top w:val="single" w:sz="6" w:space="0" w:color="000000"/>
+              <w:left w:val="single" w:sz="6" w:space="0" w:color="000000"/>
+              <w:bottom w:val="single" w:sz="6" w:space="0" w:color="000000"/>
+              <w:right w:val="single" w:sz="6" w:space="0" w:color="000000"/>
+            </w:tcBorders>
+            <w:tcMar>
+              <w:top w:w="80" w:type="dxa"/>
+              <w:left w:w="100" w:type="dxa"/>
+              <w:bottom w:w="80" w:type="dxa"/>
+              <w:right w:w="100" w:type="dxa"/>
+            </w:tcMar>
+            <w:vAlign w:val="center"/>
+          </w:tcPr>
+          <w:p>
+            <w:pPr>
+              <w:jc w:val="center"/>
+              <w:rPr>
+                <w:rFonts w:ascii="Arial" w:hAnsi="Arial" w:cs="Arial"/>
+                <w:sz w:val="22"/>
+                <w:szCs w:val="22"/>
+              </w:rPr>
+            </w:pPr>
+            <w:r>
+              <w:rPr>
+                <w:rFonts w:ascii="Arial" w:hAnsi="Arial" w:cs="Arial"/>
+                <w:sz w:val="22"/>
+                <w:szCs w:val="22"/>
+              </w:rPr>
+              <w:t>10</w:t>
+            </w:r>
           </w:p>
         </w:tc>
         <w:tc>
@@ -710,6 +937,11 @@
                 <w:ilvl w:val="0"/>
                 <w:numId w:val="2"/>
               </w:numPr>
+              <w:rPr>
+                <w:rFonts w:ascii="Arial" w:hAnsi="Arial" w:cs="Arial"/>
+                <w:sz w:val="22"/>
+                <w:szCs w:val="22"/>
+              </w:rPr>
             </w:pPr>
             <w:r>
               <w:rPr>
@@ -727,6 +959,11 @@
                 <w:ilvl w:val="0"/>
                 <w:numId w:val="2"/>
               </w:numPr>
+              <w:rPr>
+                <w:rFonts w:ascii="Arial" w:hAnsi="Arial" w:cs="Arial"/>
+                <w:sz w:val="22"/>
+                <w:szCs w:val="22"/>
+              </w:rPr>
             </w:pPr>
             <w:r>
               <w:rPr>
@@ -740,12 +977,6 @@
         </w:tc>
       </w:tr>
       <w:tr>
-        <w:tblPrEx>
-          <w:tblCellMar>
-            <w:top w:w="0" w:type="dxa"/>
-            <w:bottom w:w="0" w:type="dxa"/>
-          </w:tblCellMar>
-        </w:tblPrEx>
         <w:tc>
           <w:tcPr>
             <w:tcW w:w="2000" w:type="dxa"/>
@@ -767,6 +998,11 @@
           <w:p>
             <w:pPr>
               <w:jc w:val="center"/>
+              <w:rPr>
+                <w:rFonts w:ascii="Arial" w:hAnsi="Arial" w:cs="Arial"/>
+                <w:sz w:val="22"/>
+                <w:szCs w:val="22"/>
+              </w:rPr>
             </w:pPr>
             <w:r>
               <w:rPr>
@@ -800,52 +1036,83 @@
           <w:p>
             <w:pPr>
               <w:jc w:val="center"/>
-            </w:pPr>
-          </w:p>
-        </w:tc>
-        <w:tc>
-          <w:tcPr>
-            <w:tcW w:w="1500" w:type="dxa"/>
-            <w:tcBorders>
-              <w:top w:val="single" w:sz="6" w:space="0" w:color="000000"/>
-              <w:left w:val="single" w:sz="6" w:space="0" w:color="000000"/>
-              <w:bottom w:val="single" w:sz="6" w:space="0" w:color="000000"/>
-              <w:right w:val="single" w:sz="6" w:space="0" w:color="000000"/>
-            </w:tcBorders>
-            <w:tcMar>
-              <w:top w:w="80" w:type="dxa"/>
-              <w:left w:w="100" w:type="dxa"/>
-              <w:bottom w:w="80" w:type="dxa"/>
-              <w:right w:w="100" w:type="dxa"/>
-            </w:tcMar>
-            <w:vAlign w:val="center"/>
-          </w:tcPr>
-          <w:p>
-            <w:pPr>
-              <w:jc w:val="center"/>
-            </w:pPr>
-          </w:p>
-        </w:tc>
-        <w:tc>
-          <w:tcPr>
-            <w:tcW w:w="1500" w:type="dxa"/>
-            <w:tcBorders>
-              <w:top w:val="single" w:sz="6" w:space="0" w:color="000000"/>
-              <w:left w:val="single" w:sz="6" w:space="0" w:color="000000"/>
-              <w:bottom w:val="single" w:sz="6" w:space="0" w:color="000000"/>
-              <w:right w:val="single" w:sz="6" w:space="0" w:color="000000"/>
-            </w:tcBorders>
-            <w:tcMar>
-              <w:top w:w="80" w:type="dxa"/>
-              <w:left w:w="100" w:type="dxa"/>
-              <w:bottom w:w="80" w:type="dxa"/>
-              <w:right w:w="100" w:type="dxa"/>
-            </w:tcMar>
-            <w:vAlign w:val="center"/>
-          </w:tcPr>
-          <w:p>
-            <w:pPr>
-              <w:jc w:val="center"/>
+              <w:rPr>
+                <w:rFonts w:ascii="Arial" w:hAnsi="Arial" w:cs="Arial"/>
+                <w:sz w:val="22"/>
+                <w:szCs w:val="22"/>
+              </w:rPr>
+            </w:pPr>
+            <w:r>
+              <w:rPr>
+                <w:rFonts w:ascii="Arial" w:hAnsi="Arial" w:cs="Arial"/>
+                <w:sz w:val="22"/>
+                <w:szCs w:val="22"/>
+              </w:rPr>
+              <w:t>10</w:t>
+            </w:r>
+          </w:p>
+        </w:tc>
+        <w:tc>
+          <w:tcPr>
+            <w:tcW w:w="1500" w:type="dxa"/>
+            <w:tcBorders>
+              <w:top w:val="single" w:sz="6" w:space="0" w:color="000000"/>
+              <w:left w:val="single" w:sz="6" w:space="0" w:color="000000"/>
+              <w:bottom w:val="single" w:sz="6" w:space="0" w:color="000000"/>
+              <w:right w:val="single" w:sz="6" w:space="0" w:color="000000"/>
+            </w:tcBorders>
+            <w:tcMar>
+              <w:top w:w="80" w:type="dxa"/>
+              <w:left w:w="100" w:type="dxa"/>
+              <w:bottom w:w="80" w:type="dxa"/>
+              <w:right w:w="100" w:type="dxa"/>
+            </w:tcMar>
+            <w:vAlign w:val="center"/>
+          </w:tcPr>
+          <w:p>
+            <w:pPr>
+              <w:jc w:val="center"/>
+              <w:rPr>
+                <w:rFonts w:ascii="Arial" w:hAnsi="Arial" w:cs="Arial"/>
+                <w:sz w:val="22"/>
+                <w:szCs w:val="22"/>
+              </w:rPr>
+            </w:pPr>
+            <w:r>
+              <w:rPr>
+                <w:rFonts w:ascii="Arial" w:hAnsi="Arial" w:cs="Arial"/>
+                <w:sz w:val="22"/>
+                <w:szCs w:val="22"/>
+              </w:rPr>
+              <w:t>10</w:t>
+            </w:r>
+          </w:p>
+        </w:tc>
+        <w:tc>
+          <w:tcPr>
+            <w:tcW w:w="1500" w:type="dxa"/>
+            <w:tcBorders>
+              <w:top w:val="single" w:sz="6" w:space="0" w:color="000000"/>
+              <w:left w:val="single" w:sz="6" w:space="0" w:color="000000"/>
+              <w:bottom w:val="single" w:sz="6" w:space="0" w:color="000000"/>
+              <w:right w:val="single" w:sz="6" w:space="0" w:color="000000"/>
+            </w:tcBorders>
+            <w:tcMar>
+              <w:top w:w="80" w:type="dxa"/>
+              <w:left w:w="100" w:type="dxa"/>
+              <w:bottom w:w="80" w:type="dxa"/>
+              <w:right w:w="100" w:type="dxa"/>
+            </w:tcMar>
+            <w:vAlign w:val="center"/>
+          </w:tcPr>
+          <w:p>
+            <w:pPr>
+              <w:jc w:val="center"/>
+              <w:rPr>
+                <w:rFonts w:ascii="Arial" w:hAnsi="Arial" w:cs="Arial"/>
+                <w:sz w:val="22"/>
+                <w:szCs w:val="22"/>
+              </w:rPr>
             </w:pPr>
             <w:r>
               <w:rPr>
@@ -877,30 +1144,56 @@
           <w:p>
             <w:pPr>
               <w:jc w:val="center"/>
-            </w:pPr>
-          </w:p>
-        </w:tc>
-        <w:tc>
-          <w:tcPr>
-            <w:tcW w:w="1500" w:type="dxa"/>
-            <w:tcBorders>
-              <w:top w:val="single" w:sz="6" w:space="0" w:color="000000"/>
-              <w:left w:val="single" w:sz="6" w:space="0" w:color="000000"/>
-              <w:bottom w:val="single" w:sz="6" w:space="0" w:color="000000"/>
-              <w:right w:val="single" w:sz="6" w:space="0" w:color="000000"/>
-            </w:tcBorders>
-            <w:tcMar>
-              <w:top w:w="80" w:type="dxa"/>
-              <w:left w:w="100" w:type="dxa"/>
-              <w:bottom w:w="80" w:type="dxa"/>
-              <w:right w:w="100" w:type="dxa"/>
-            </w:tcMar>
-            <w:vAlign w:val="center"/>
-          </w:tcPr>
-          <w:p>
-            <w:pPr>
-              <w:jc w:val="center"/>
-            </w:pPr>
+              <w:rPr>
+                <w:rFonts w:ascii="Arial" w:hAnsi="Arial" w:cs="Arial"/>
+                <w:sz w:val="22"/>
+                <w:szCs w:val="22"/>
+              </w:rPr>
+            </w:pPr>
+            <w:r>
+              <w:rPr>
+                <w:rFonts w:ascii="Arial" w:hAnsi="Arial" w:cs="Arial"/>
+                <w:sz w:val="22"/>
+                <w:szCs w:val="22"/>
+              </w:rPr>
+              <w:t>10</w:t>
+            </w:r>
+          </w:p>
+        </w:tc>
+        <w:tc>
+          <w:tcPr>
+            <w:tcW w:w="1500" w:type="dxa"/>
+            <w:tcBorders>
+              <w:top w:val="single" w:sz="6" w:space="0" w:color="000000"/>
+              <w:left w:val="single" w:sz="6" w:space="0" w:color="000000"/>
+              <w:bottom w:val="single" w:sz="6" w:space="0" w:color="000000"/>
+              <w:right w:val="single" w:sz="6" w:space="0" w:color="000000"/>
+            </w:tcBorders>
+            <w:tcMar>
+              <w:top w:w="80" w:type="dxa"/>
+              <w:left w:w="100" w:type="dxa"/>
+              <w:bottom w:w="80" w:type="dxa"/>
+              <w:right w:w="100" w:type="dxa"/>
+            </w:tcMar>
+            <w:vAlign w:val="center"/>
+          </w:tcPr>
+          <w:p>
+            <w:pPr>
+              <w:jc w:val="center"/>
+              <w:rPr>
+                <w:rFonts w:ascii="Arial" w:hAnsi="Arial" w:cs="Arial"/>
+                <w:sz w:val="22"/>
+                <w:szCs w:val="22"/>
+              </w:rPr>
+            </w:pPr>
+            <w:r>
+              <w:rPr>
+                <w:rFonts w:ascii="Arial" w:hAnsi="Arial" w:cs="Arial"/>
+                <w:sz w:val="22"/>
+                <w:szCs w:val="22"/>
+              </w:rPr>
+              <w:t>10</w:t>
+            </w:r>
           </w:p>
         </w:tc>
         <w:tc>
@@ -927,6 +1220,11 @@
                 <w:ilvl w:val="0"/>
                 <w:numId w:val="2"/>
               </w:numPr>
+              <w:rPr>
+                <w:rFonts w:ascii="Arial" w:hAnsi="Arial" w:cs="Arial"/>
+                <w:sz w:val="22"/>
+                <w:szCs w:val="22"/>
+              </w:rPr>
             </w:pPr>
             <w:r>
               <w:rPr>
@@ -934,18 +1232,36 @@
                 <w:sz w:val="22"/>
                 <w:szCs w:val="22"/>
               </w:rPr>
-              <w:t>Worked on input/output separators and print statements</w:t>
+              <w:t xml:space="preserve">Worked on </w:t>
+            </w:r>
+            <w:r>
+              <w:rPr>
+                <w:rFonts w:ascii="Arial" w:eastAsia="Arial" w:hAnsi="Arial" w:cs="Arial"/>
+                <w:sz w:val="22"/>
+                <w:szCs w:val="22"/>
+              </w:rPr>
+              <w:t xml:space="preserve">print </w:t>
+            </w:r>
+            <w:r>
+              <w:rPr>
+                <w:rFonts w:ascii="Arial" w:eastAsia="Arial" w:hAnsi="Arial" w:cs="Arial"/>
+                <w:sz w:val="22"/>
+                <w:szCs w:val="22"/>
+              </w:rPr>
+              <w:t>statements</w:t>
+            </w:r>
+            <w:r>
+              <w:rPr>
+                <w:rFonts w:ascii="Arial" w:eastAsia="Arial" w:hAnsi="Arial" w:cs="Arial"/>
+                <w:sz w:val="22"/>
+                <w:szCs w:val="22"/>
+              </w:rPr>
+              <w:t xml:space="preserve"> and separators</w:t>
             </w:r>
           </w:p>
         </w:tc>
       </w:tr>
       <w:tr>
-        <w:tblPrEx>
-          <w:tblCellMar>
-            <w:top w:w="0" w:type="dxa"/>
-            <w:bottom w:w="0" w:type="dxa"/>
-          </w:tblCellMar>
-        </w:tblPrEx>
         <w:tc>
           <w:tcPr>
             <w:tcW w:w="2000" w:type="dxa"/>
@@ -967,6 +1283,11 @@
           <w:p>
             <w:pPr>
               <w:jc w:val="center"/>
+              <w:rPr>
+                <w:rFonts w:ascii="Arial" w:hAnsi="Arial" w:cs="Arial"/>
+                <w:sz w:val="22"/>
+                <w:szCs w:val="22"/>
+              </w:rPr>
             </w:pPr>
             <w:r>
               <w:rPr>
@@ -1000,75 +1321,119 @@
           <w:p>
             <w:pPr>
               <w:jc w:val="center"/>
-            </w:pPr>
-          </w:p>
-        </w:tc>
-        <w:tc>
-          <w:tcPr>
-            <w:tcW w:w="1500" w:type="dxa"/>
-            <w:tcBorders>
-              <w:top w:val="single" w:sz="6" w:space="0" w:color="000000"/>
-              <w:left w:val="single" w:sz="6" w:space="0" w:color="000000"/>
-              <w:bottom w:val="single" w:sz="6" w:space="0" w:color="000000"/>
-              <w:right w:val="single" w:sz="6" w:space="0" w:color="000000"/>
-            </w:tcBorders>
-            <w:tcMar>
-              <w:top w:w="80" w:type="dxa"/>
-              <w:left w:w="100" w:type="dxa"/>
-              <w:bottom w:w="80" w:type="dxa"/>
-              <w:right w:w="100" w:type="dxa"/>
-            </w:tcMar>
-            <w:vAlign w:val="center"/>
-          </w:tcPr>
-          <w:p>
-            <w:pPr>
-              <w:jc w:val="center"/>
-            </w:pPr>
-          </w:p>
-        </w:tc>
-        <w:tc>
-          <w:tcPr>
-            <w:tcW w:w="1500" w:type="dxa"/>
-            <w:tcBorders>
-              <w:top w:val="single" w:sz="6" w:space="0" w:color="000000"/>
-              <w:left w:val="single" w:sz="6" w:space="0" w:color="000000"/>
-              <w:bottom w:val="single" w:sz="6" w:space="0" w:color="000000"/>
-              <w:right w:val="single" w:sz="6" w:space="0" w:color="000000"/>
-            </w:tcBorders>
-            <w:tcMar>
-              <w:top w:w="80" w:type="dxa"/>
-              <w:left w:w="100" w:type="dxa"/>
-              <w:bottom w:w="80" w:type="dxa"/>
-              <w:right w:w="100" w:type="dxa"/>
-            </w:tcMar>
-            <w:vAlign w:val="center"/>
-          </w:tcPr>
-          <w:p>
-            <w:pPr>
-              <w:jc w:val="center"/>
-            </w:pPr>
-          </w:p>
-        </w:tc>
-        <w:tc>
-          <w:tcPr>
-            <w:tcW w:w="1500" w:type="dxa"/>
-            <w:tcBorders>
-              <w:top w:val="single" w:sz="6" w:space="0" w:color="000000"/>
-              <w:left w:val="single" w:sz="6" w:space="0" w:color="000000"/>
-              <w:bottom w:val="single" w:sz="6" w:space="0" w:color="000000"/>
-              <w:right w:val="single" w:sz="6" w:space="0" w:color="000000"/>
-            </w:tcBorders>
-            <w:tcMar>
-              <w:top w:w="80" w:type="dxa"/>
-              <w:left w:w="100" w:type="dxa"/>
-              <w:bottom w:w="80" w:type="dxa"/>
-              <w:right w:w="100" w:type="dxa"/>
-            </w:tcMar>
-            <w:vAlign w:val="center"/>
-          </w:tcPr>
-          <w:p>
-            <w:pPr>
-              <w:jc w:val="center"/>
+              <w:rPr>
+                <w:rFonts w:ascii="Arial" w:hAnsi="Arial" w:cs="Arial"/>
+                <w:sz w:val="22"/>
+                <w:szCs w:val="22"/>
+              </w:rPr>
+            </w:pPr>
+            <w:r>
+              <w:rPr>
+                <w:rFonts w:ascii="Arial" w:hAnsi="Arial" w:cs="Arial"/>
+                <w:sz w:val="22"/>
+                <w:szCs w:val="22"/>
+              </w:rPr>
+              <w:t>10</w:t>
+            </w:r>
+          </w:p>
+        </w:tc>
+        <w:tc>
+          <w:tcPr>
+            <w:tcW w:w="1500" w:type="dxa"/>
+            <w:tcBorders>
+              <w:top w:val="single" w:sz="6" w:space="0" w:color="000000"/>
+              <w:left w:val="single" w:sz="6" w:space="0" w:color="000000"/>
+              <w:bottom w:val="single" w:sz="6" w:space="0" w:color="000000"/>
+              <w:right w:val="single" w:sz="6" w:space="0" w:color="000000"/>
+            </w:tcBorders>
+            <w:tcMar>
+              <w:top w:w="80" w:type="dxa"/>
+              <w:left w:w="100" w:type="dxa"/>
+              <w:bottom w:w="80" w:type="dxa"/>
+              <w:right w:w="100" w:type="dxa"/>
+            </w:tcMar>
+            <w:vAlign w:val="center"/>
+          </w:tcPr>
+          <w:p>
+            <w:pPr>
+              <w:jc w:val="center"/>
+              <w:rPr>
+                <w:rFonts w:ascii="Arial" w:hAnsi="Arial" w:cs="Arial"/>
+                <w:sz w:val="22"/>
+                <w:szCs w:val="22"/>
+              </w:rPr>
+            </w:pPr>
+            <w:r>
+              <w:rPr>
+                <w:rFonts w:ascii="Arial" w:hAnsi="Arial" w:cs="Arial"/>
+                <w:sz w:val="22"/>
+                <w:szCs w:val="22"/>
+              </w:rPr>
+              <w:t>10</w:t>
+            </w:r>
+          </w:p>
+        </w:tc>
+        <w:tc>
+          <w:tcPr>
+            <w:tcW w:w="1500" w:type="dxa"/>
+            <w:tcBorders>
+              <w:top w:val="single" w:sz="6" w:space="0" w:color="000000"/>
+              <w:left w:val="single" w:sz="6" w:space="0" w:color="000000"/>
+              <w:bottom w:val="single" w:sz="6" w:space="0" w:color="000000"/>
+              <w:right w:val="single" w:sz="6" w:space="0" w:color="000000"/>
+            </w:tcBorders>
+            <w:tcMar>
+              <w:top w:w="80" w:type="dxa"/>
+              <w:left w:w="100" w:type="dxa"/>
+              <w:bottom w:w="80" w:type="dxa"/>
+              <w:right w:w="100" w:type="dxa"/>
+            </w:tcMar>
+            <w:vAlign w:val="center"/>
+          </w:tcPr>
+          <w:p>
+            <w:pPr>
+              <w:jc w:val="center"/>
+              <w:rPr>
+                <w:rFonts w:ascii="Arial" w:hAnsi="Arial" w:cs="Arial"/>
+                <w:sz w:val="22"/>
+                <w:szCs w:val="22"/>
+              </w:rPr>
+            </w:pPr>
+            <w:r>
+              <w:rPr>
+                <w:rFonts w:ascii="Arial" w:hAnsi="Arial" w:cs="Arial"/>
+                <w:sz w:val="22"/>
+                <w:szCs w:val="22"/>
+              </w:rPr>
+              <w:t>10</w:t>
+            </w:r>
+          </w:p>
+        </w:tc>
+        <w:tc>
+          <w:tcPr>
+            <w:tcW w:w="1500" w:type="dxa"/>
+            <w:tcBorders>
+              <w:top w:val="single" w:sz="6" w:space="0" w:color="000000"/>
+              <w:left w:val="single" w:sz="6" w:space="0" w:color="000000"/>
+              <w:bottom w:val="single" w:sz="6" w:space="0" w:color="000000"/>
+              <w:right w:val="single" w:sz="6" w:space="0" w:color="000000"/>
+            </w:tcBorders>
+            <w:tcMar>
+              <w:top w:w="80" w:type="dxa"/>
+              <w:left w:w="100" w:type="dxa"/>
+              <w:bottom w:w="80" w:type="dxa"/>
+              <w:right w:w="100" w:type="dxa"/>
+            </w:tcMar>
+            <w:vAlign w:val="center"/>
+          </w:tcPr>
+          <w:p>
+            <w:pPr>
+              <w:jc w:val="center"/>
+              <w:rPr>
+                <w:rFonts w:ascii="Arial" w:hAnsi="Arial" w:cs="Arial"/>
+                <w:sz w:val="22"/>
+                <w:szCs w:val="22"/>
+              </w:rPr>
             </w:pPr>
             <w:r>
               <w:rPr>
@@ -1100,7 +1465,20 @@
           <w:p>
             <w:pPr>
               <w:jc w:val="center"/>
-            </w:pPr>
+              <w:rPr>
+                <w:rFonts w:ascii="Arial" w:hAnsi="Arial" w:cs="Arial"/>
+                <w:sz w:val="22"/>
+                <w:szCs w:val="22"/>
+              </w:rPr>
+            </w:pPr>
+            <w:r>
+              <w:rPr>
+                <w:rFonts w:ascii="Arial" w:hAnsi="Arial" w:cs="Arial"/>
+                <w:sz w:val="22"/>
+                <w:szCs w:val="22"/>
+              </w:rPr>
+              <w:t>10</w:t>
+            </w:r>
           </w:p>
         </w:tc>
         <w:tc>
@@ -1127,6 +1505,11 @@
                 <w:ilvl w:val="0"/>
                 <w:numId w:val="2"/>
               </w:numPr>
+              <w:rPr>
+                <w:rFonts w:ascii="Arial" w:hAnsi="Arial" w:cs="Arial"/>
+                <w:sz w:val="22"/>
+                <w:szCs w:val="22"/>
+              </w:rPr>
             </w:pPr>
             <w:r>
               <w:rPr>
@@ -1140,12 +1523,6 @@
         </w:tc>
       </w:tr>
       <w:tr>
-        <w:tblPrEx>
-          <w:tblCellMar>
-            <w:top w:w="0" w:type="dxa"/>
-            <w:bottom w:w="0" w:type="dxa"/>
-          </w:tblCellMar>
-        </w:tblPrEx>
         <w:tc>
           <w:tcPr>
             <w:tcW w:w="2000" w:type="dxa"/>
@@ -1167,6 +1544,11 @@
           <w:p>
             <w:pPr>
               <w:jc w:val="center"/>
+              <w:rPr>
+                <w:rFonts w:ascii="Arial" w:hAnsi="Arial" w:cs="Arial"/>
+                <w:sz w:val="22"/>
+                <w:szCs w:val="22"/>
+              </w:rPr>
             </w:pPr>
             <w:r>
               <w:rPr>
@@ -1200,98 +1582,155 @@
           <w:p>
             <w:pPr>
               <w:jc w:val="center"/>
-            </w:pPr>
-          </w:p>
-        </w:tc>
-        <w:tc>
-          <w:tcPr>
-            <w:tcW w:w="1500" w:type="dxa"/>
-            <w:tcBorders>
-              <w:top w:val="single" w:sz="6" w:space="0" w:color="000000"/>
-              <w:left w:val="single" w:sz="6" w:space="0" w:color="000000"/>
-              <w:bottom w:val="single" w:sz="6" w:space="0" w:color="000000"/>
-              <w:right w:val="single" w:sz="6" w:space="0" w:color="000000"/>
-            </w:tcBorders>
-            <w:tcMar>
-              <w:top w:w="80" w:type="dxa"/>
-              <w:left w:w="100" w:type="dxa"/>
-              <w:bottom w:w="80" w:type="dxa"/>
-              <w:right w:w="100" w:type="dxa"/>
-            </w:tcMar>
-            <w:vAlign w:val="center"/>
-          </w:tcPr>
-          <w:p>
-            <w:pPr>
-              <w:jc w:val="center"/>
-            </w:pPr>
-          </w:p>
-        </w:tc>
-        <w:tc>
-          <w:tcPr>
-            <w:tcW w:w="1500" w:type="dxa"/>
-            <w:tcBorders>
-              <w:top w:val="single" w:sz="6" w:space="0" w:color="000000"/>
-              <w:left w:val="single" w:sz="6" w:space="0" w:color="000000"/>
-              <w:bottom w:val="single" w:sz="6" w:space="0" w:color="000000"/>
-              <w:right w:val="single" w:sz="6" w:space="0" w:color="000000"/>
-            </w:tcBorders>
-            <w:tcMar>
-              <w:top w:w="80" w:type="dxa"/>
-              <w:left w:w="100" w:type="dxa"/>
-              <w:bottom w:w="80" w:type="dxa"/>
-              <w:right w:w="100" w:type="dxa"/>
-            </w:tcMar>
-            <w:vAlign w:val="center"/>
-          </w:tcPr>
-          <w:p>
-            <w:pPr>
-              <w:jc w:val="center"/>
-            </w:pPr>
-          </w:p>
-        </w:tc>
-        <w:tc>
-          <w:tcPr>
-            <w:tcW w:w="1500" w:type="dxa"/>
-            <w:tcBorders>
-              <w:top w:val="single" w:sz="6" w:space="0" w:color="000000"/>
-              <w:left w:val="single" w:sz="6" w:space="0" w:color="000000"/>
-              <w:bottom w:val="single" w:sz="6" w:space="0" w:color="000000"/>
-              <w:right w:val="single" w:sz="6" w:space="0" w:color="000000"/>
-            </w:tcBorders>
-            <w:tcMar>
-              <w:top w:w="80" w:type="dxa"/>
-              <w:left w:w="100" w:type="dxa"/>
-              <w:bottom w:w="80" w:type="dxa"/>
-              <w:right w:w="100" w:type="dxa"/>
-            </w:tcMar>
-            <w:vAlign w:val="center"/>
-          </w:tcPr>
-          <w:p>
-            <w:pPr>
-              <w:jc w:val="center"/>
-            </w:pPr>
-          </w:p>
-        </w:tc>
-        <w:tc>
-          <w:tcPr>
-            <w:tcW w:w="1500" w:type="dxa"/>
-            <w:tcBorders>
-              <w:top w:val="single" w:sz="6" w:space="0" w:color="000000"/>
-              <w:left w:val="single" w:sz="6" w:space="0" w:color="000000"/>
-              <w:bottom w:val="single" w:sz="6" w:space="0" w:color="000000"/>
-              <w:right w:val="single" w:sz="6" w:space="0" w:color="000000"/>
-            </w:tcBorders>
-            <w:tcMar>
-              <w:top w:w="80" w:type="dxa"/>
-              <w:left w:w="100" w:type="dxa"/>
-              <w:bottom w:w="80" w:type="dxa"/>
-              <w:right w:w="100" w:type="dxa"/>
-            </w:tcMar>
-            <w:vAlign w:val="center"/>
-          </w:tcPr>
-          <w:p>
-            <w:pPr>
-              <w:jc w:val="center"/>
+              <w:rPr>
+                <w:rFonts w:ascii="Arial" w:hAnsi="Arial" w:cs="Arial"/>
+                <w:sz w:val="22"/>
+                <w:szCs w:val="22"/>
+              </w:rPr>
+            </w:pPr>
+            <w:r>
+              <w:rPr>
+                <w:rFonts w:ascii="Arial" w:hAnsi="Arial" w:cs="Arial"/>
+                <w:sz w:val="22"/>
+                <w:szCs w:val="22"/>
+              </w:rPr>
+              <w:t>10</w:t>
+            </w:r>
+          </w:p>
+        </w:tc>
+        <w:tc>
+          <w:tcPr>
+            <w:tcW w:w="1500" w:type="dxa"/>
+            <w:tcBorders>
+              <w:top w:val="single" w:sz="6" w:space="0" w:color="000000"/>
+              <w:left w:val="single" w:sz="6" w:space="0" w:color="000000"/>
+              <w:bottom w:val="single" w:sz="6" w:space="0" w:color="000000"/>
+              <w:right w:val="single" w:sz="6" w:space="0" w:color="000000"/>
+            </w:tcBorders>
+            <w:tcMar>
+              <w:top w:w="80" w:type="dxa"/>
+              <w:left w:w="100" w:type="dxa"/>
+              <w:bottom w:w="80" w:type="dxa"/>
+              <w:right w:w="100" w:type="dxa"/>
+            </w:tcMar>
+            <w:vAlign w:val="center"/>
+          </w:tcPr>
+          <w:p>
+            <w:pPr>
+              <w:jc w:val="center"/>
+              <w:rPr>
+                <w:rFonts w:ascii="Arial" w:hAnsi="Arial" w:cs="Arial"/>
+                <w:sz w:val="22"/>
+                <w:szCs w:val="22"/>
+              </w:rPr>
+            </w:pPr>
+            <w:r>
+              <w:rPr>
+                <w:rFonts w:ascii="Arial" w:hAnsi="Arial" w:cs="Arial"/>
+                <w:sz w:val="22"/>
+                <w:szCs w:val="22"/>
+              </w:rPr>
+              <w:t>10</w:t>
+            </w:r>
+          </w:p>
+        </w:tc>
+        <w:tc>
+          <w:tcPr>
+            <w:tcW w:w="1500" w:type="dxa"/>
+            <w:tcBorders>
+              <w:top w:val="single" w:sz="6" w:space="0" w:color="000000"/>
+              <w:left w:val="single" w:sz="6" w:space="0" w:color="000000"/>
+              <w:bottom w:val="single" w:sz="6" w:space="0" w:color="000000"/>
+              <w:right w:val="single" w:sz="6" w:space="0" w:color="000000"/>
+            </w:tcBorders>
+            <w:tcMar>
+              <w:top w:w="80" w:type="dxa"/>
+              <w:left w:w="100" w:type="dxa"/>
+              <w:bottom w:w="80" w:type="dxa"/>
+              <w:right w:w="100" w:type="dxa"/>
+            </w:tcMar>
+            <w:vAlign w:val="center"/>
+          </w:tcPr>
+          <w:p>
+            <w:pPr>
+              <w:jc w:val="center"/>
+              <w:rPr>
+                <w:rFonts w:ascii="Arial" w:hAnsi="Arial" w:cs="Arial"/>
+                <w:sz w:val="22"/>
+                <w:szCs w:val="22"/>
+              </w:rPr>
+            </w:pPr>
+            <w:r>
+              <w:rPr>
+                <w:rFonts w:ascii="Arial" w:hAnsi="Arial" w:cs="Arial"/>
+                <w:sz w:val="22"/>
+                <w:szCs w:val="22"/>
+              </w:rPr>
+              <w:t>10</w:t>
+            </w:r>
+          </w:p>
+        </w:tc>
+        <w:tc>
+          <w:tcPr>
+            <w:tcW w:w="1500" w:type="dxa"/>
+            <w:tcBorders>
+              <w:top w:val="single" w:sz="6" w:space="0" w:color="000000"/>
+              <w:left w:val="single" w:sz="6" w:space="0" w:color="000000"/>
+              <w:bottom w:val="single" w:sz="6" w:space="0" w:color="000000"/>
+              <w:right w:val="single" w:sz="6" w:space="0" w:color="000000"/>
+            </w:tcBorders>
+            <w:tcMar>
+              <w:top w:w="80" w:type="dxa"/>
+              <w:left w:w="100" w:type="dxa"/>
+              <w:bottom w:w="80" w:type="dxa"/>
+              <w:right w:w="100" w:type="dxa"/>
+            </w:tcMar>
+            <w:vAlign w:val="center"/>
+          </w:tcPr>
+          <w:p>
+            <w:pPr>
+              <w:jc w:val="center"/>
+              <w:rPr>
+                <w:rFonts w:ascii="Arial" w:hAnsi="Arial" w:cs="Arial"/>
+                <w:sz w:val="22"/>
+                <w:szCs w:val="22"/>
+              </w:rPr>
+            </w:pPr>
+            <w:r>
+              <w:rPr>
+                <w:rFonts w:ascii="Arial" w:hAnsi="Arial" w:cs="Arial"/>
+                <w:sz w:val="22"/>
+                <w:szCs w:val="22"/>
+              </w:rPr>
+              <w:t>10</w:t>
+            </w:r>
+          </w:p>
+        </w:tc>
+        <w:tc>
+          <w:tcPr>
+            <w:tcW w:w="1500" w:type="dxa"/>
+            <w:tcBorders>
+              <w:top w:val="single" w:sz="6" w:space="0" w:color="000000"/>
+              <w:left w:val="single" w:sz="6" w:space="0" w:color="000000"/>
+              <w:bottom w:val="single" w:sz="6" w:space="0" w:color="000000"/>
+              <w:right w:val="single" w:sz="6" w:space="0" w:color="000000"/>
+            </w:tcBorders>
+            <w:tcMar>
+              <w:top w:w="80" w:type="dxa"/>
+              <w:left w:w="100" w:type="dxa"/>
+              <w:bottom w:w="80" w:type="dxa"/>
+              <w:right w:w="100" w:type="dxa"/>
+            </w:tcMar>
+            <w:vAlign w:val="center"/>
+          </w:tcPr>
+          <w:p>
+            <w:pPr>
+              <w:jc w:val="center"/>
+              <w:rPr>
+                <w:rFonts w:ascii="Arial" w:hAnsi="Arial" w:cs="Arial"/>
+                <w:sz w:val="22"/>
+                <w:szCs w:val="22"/>
+              </w:rPr>
             </w:pPr>
             <w:r>
               <w:rPr>
@@ -1327,6 +1766,11 @@
                 <w:ilvl w:val="0"/>
                 <w:numId w:val="2"/>
               </w:numPr>
+              <w:rPr>
+                <w:rFonts w:ascii="Arial" w:hAnsi="Arial" w:cs="Arial"/>
+                <w:sz w:val="22"/>
+                <w:szCs w:val="22"/>
+              </w:rPr>
             </w:pPr>
             <w:r>
               <w:rPr>
@@ -1344,6 +1788,11 @@
                 <w:ilvl w:val="0"/>
                 <w:numId w:val="2"/>
               </w:numPr>
+              <w:rPr>
+                <w:rFonts w:ascii="Arial" w:hAnsi="Arial" w:cs="Arial"/>
+                <w:sz w:val="22"/>
+                <w:szCs w:val="22"/>
+              </w:rPr>
             </w:pPr>
             <w:r>
               <w:rPr>
@@ -1357,12 +1806,6 @@
         </w:tc>
       </w:tr>
       <w:tr>
-        <w:tblPrEx>
-          <w:tblCellMar>
-            <w:top w:w="0" w:type="dxa"/>
-            <w:bottom w:w="0" w:type="dxa"/>
-          </w:tblCellMar>
-        </w:tblPrEx>
         <w:tc>
           <w:tcPr>
             <w:tcW w:w="2000" w:type="dxa"/>
@@ -1384,6 +1827,11 @@
           <w:p>
             <w:pPr>
               <w:jc w:val="center"/>
+              <w:rPr>
+                <w:rFonts w:ascii="Arial" w:hAnsi="Arial" w:cs="Arial"/>
+                <w:sz w:val="22"/>
+                <w:szCs w:val="22"/>
+              </w:rPr>
             </w:pPr>
             <w:r>
               <w:rPr>
@@ -1417,99 +1865,164 @@
           <w:p>
             <w:pPr>
               <w:jc w:val="center"/>
-            </w:pPr>
-          </w:p>
-        </w:tc>
-        <w:tc>
-          <w:tcPr>
-            <w:tcW w:w="1500" w:type="dxa"/>
-            <w:tcBorders>
-              <w:top w:val="single" w:sz="6" w:space="0" w:color="000000"/>
-              <w:left w:val="single" w:sz="6" w:space="0" w:color="000000"/>
-              <w:bottom w:val="single" w:sz="6" w:space="0" w:color="000000"/>
-              <w:right w:val="single" w:sz="6" w:space="0" w:color="000000"/>
-            </w:tcBorders>
-            <w:tcMar>
-              <w:top w:w="80" w:type="dxa"/>
-              <w:left w:w="100" w:type="dxa"/>
-              <w:bottom w:w="80" w:type="dxa"/>
-              <w:right w:w="100" w:type="dxa"/>
-            </w:tcMar>
-            <w:vAlign w:val="center"/>
-          </w:tcPr>
-          <w:p>
-            <w:pPr>
-              <w:jc w:val="center"/>
-            </w:pPr>
-          </w:p>
-        </w:tc>
-        <w:tc>
-          <w:tcPr>
-            <w:tcW w:w="1500" w:type="dxa"/>
-            <w:tcBorders>
-              <w:top w:val="single" w:sz="6" w:space="0" w:color="000000"/>
-              <w:left w:val="single" w:sz="6" w:space="0" w:color="000000"/>
-              <w:bottom w:val="single" w:sz="6" w:space="0" w:color="000000"/>
-              <w:right w:val="single" w:sz="6" w:space="0" w:color="000000"/>
-            </w:tcBorders>
-            <w:tcMar>
-              <w:top w:w="80" w:type="dxa"/>
-              <w:left w:w="100" w:type="dxa"/>
-              <w:bottom w:w="80" w:type="dxa"/>
-              <w:right w:w="100" w:type="dxa"/>
-            </w:tcMar>
-            <w:vAlign w:val="center"/>
-          </w:tcPr>
-          <w:p>
-            <w:pPr>
-              <w:jc w:val="center"/>
-            </w:pPr>
-          </w:p>
-        </w:tc>
-        <w:tc>
-          <w:tcPr>
-            <w:tcW w:w="1500" w:type="dxa"/>
-            <w:tcBorders>
-              <w:top w:val="single" w:sz="6" w:space="0" w:color="000000"/>
-              <w:left w:val="single" w:sz="6" w:space="0" w:color="000000"/>
-              <w:bottom w:val="single" w:sz="6" w:space="0" w:color="000000"/>
-              <w:right w:val="single" w:sz="6" w:space="0" w:color="000000"/>
-            </w:tcBorders>
-            <w:tcMar>
-              <w:top w:w="80" w:type="dxa"/>
-              <w:left w:w="100" w:type="dxa"/>
-              <w:bottom w:w="80" w:type="dxa"/>
-              <w:right w:w="100" w:type="dxa"/>
-            </w:tcMar>
-            <w:vAlign w:val="center"/>
-          </w:tcPr>
-          <w:p>
-            <w:pPr>
-              <w:jc w:val="center"/>
-            </w:pPr>
-          </w:p>
-        </w:tc>
-        <w:tc>
-          <w:tcPr>
-            <w:tcW w:w="1500" w:type="dxa"/>
-            <w:tcBorders>
-              <w:top w:val="single" w:sz="6" w:space="0" w:color="000000"/>
-              <w:left w:val="single" w:sz="6" w:space="0" w:color="000000"/>
-              <w:bottom w:val="single" w:sz="6" w:space="0" w:color="000000"/>
-              <w:right w:val="single" w:sz="6" w:space="0" w:color="000000"/>
-            </w:tcBorders>
-            <w:tcMar>
-              <w:top w:w="80" w:type="dxa"/>
-              <w:left w:w="100" w:type="dxa"/>
-              <w:bottom w:w="80" w:type="dxa"/>
-              <w:right w:w="100" w:type="dxa"/>
-            </w:tcMar>
-            <w:vAlign w:val="center"/>
-          </w:tcPr>
-          <w:p>
-            <w:pPr>
-              <w:jc w:val="center"/>
-            </w:pPr>
+              <w:rPr>
+                <w:rFonts w:ascii="Arial" w:hAnsi="Arial" w:cs="Arial"/>
+                <w:sz w:val="22"/>
+                <w:szCs w:val="22"/>
+              </w:rPr>
+            </w:pPr>
+            <w:r>
+              <w:rPr>
+                <w:rFonts w:ascii="Arial" w:hAnsi="Arial" w:cs="Arial"/>
+                <w:sz w:val="22"/>
+                <w:szCs w:val="22"/>
+              </w:rPr>
+              <w:t>10</w:t>
+            </w:r>
+          </w:p>
+        </w:tc>
+        <w:tc>
+          <w:tcPr>
+            <w:tcW w:w="1500" w:type="dxa"/>
+            <w:tcBorders>
+              <w:top w:val="single" w:sz="6" w:space="0" w:color="000000"/>
+              <w:left w:val="single" w:sz="6" w:space="0" w:color="000000"/>
+              <w:bottom w:val="single" w:sz="6" w:space="0" w:color="000000"/>
+              <w:right w:val="single" w:sz="6" w:space="0" w:color="000000"/>
+            </w:tcBorders>
+            <w:tcMar>
+              <w:top w:w="80" w:type="dxa"/>
+              <w:left w:w="100" w:type="dxa"/>
+              <w:bottom w:w="80" w:type="dxa"/>
+              <w:right w:w="100" w:type="dxa"/>
+            </w:tcMar>
+            <w:vAlign w:val="center"/>
+          </w:tcPr>
+          <w:p>
+            <w:pPr>
+              <w:jc w:val="center"/>
+              <w:rPr>
+                <w:rFonts w:ascii="Arial" w:hAnsi="Arial" w:cs="Arial"/>
+                <w:sz w:val="22"/>
+                <w:szCs w:val="22"/>
+              </w:rPr>
+            </w:pPr>
+            <w:r>
+              <w:rPr>
+                <w:rFonts w:ascii="Arial" w:hAnsi="Arial" w:cs="Arial"/>
+                <w:sz w:val="22"/>
+                <w:szCs w:val="22"/>
+              </w:rPr>
+              <w:t>10</w:t>
+            </w:r>
+          </w:p>
+        </w:tc>
+        <w:tc>
+          <w:tcPr>
+            <w:tcW w:w="1500" w:type="dxa"/>
+            <w:tcBorders>
+              <w:top w:val="single" w:sz="6" w:space="0" w:color="000000"/>
+              <w:left w:val="single" w:sz="6" w:space="0" w:color="000000"/>
+              <w:bottom w:val="single" w:sz="6" w:space="0" w:color="000000"/>
+              <w:right w:val="single" w:sz="6" w:space="0" w:color="000000"/>
+            </w:tcBorders>
+            <w:tcMar>
+              <w:top w:w="80" w:type="dxa"/>
+              <w:left w:w="100" w:type="dxa"/>
+              <w:bottom w:w="80" w:type="dxa"/>
+              <w:right w:w="100" w:type="dxa"/>
+            </w:tcMar>
+            <w:vAlign w:val="center"/>
+          </w:tcPr>
+          <w:p>
+            <w:pPr>
+              <w:jc w:val="center"/>
+              <w:rPr>
+                <w:rFonts w:ascii="Arial" w:hAnsi="Arial" w:cs="Arial"/>
+                <w:sz w:val="22"/>
+                <w:szCs w:val="22"/>
+              </w:rPr>
+            </w:pPr>
+            <w:r>
+              <w:rPr>
+                <w:rFonts w:ascii="Arial" w:hAnsi="Arial" w:cs="Arial"/>
+                <w:sz w:val="22"/>
+                <w:szCs w:val="22"/>
+              </w:rPr>
+              <w:t>10</w:t>
+            </w:r>
+          </w:p>
+        </w:tc>
+        <w:tc>
+          <w:tcPr>
+            <w:tcW w:w="1500" w:type="dxa"/>
+            <w:tcBorders>
+              <w:top w:val="single" w:sz="6" w:space="0" w:color="000000"/>
+              <w:left w:val="single" w:sz="6" w:space="0" w:color="000000"/>
+              <w:bottom w:val="single" w:sz="6" w:space="0" w:color="000000"/>
+              <w:right w:val="single" w:sz="6" w:space="0" w:color="000000"/>
+            </w:tcBorders>
+            <w:tcMar>
+              <w:top w:w="80" w:type="dxa"/>
+              <w:left w:w="100" w:type="dxa"/>
+              <w:bottom w:w="80" w:type="dxa"/>
+              <w:right w:w="100" w:type="dxa"/>
+            </w:tcMar>
+            <w:vAlign w:val="center"/>
+          </w:tcPr>
+          <w:p>
+            <w:pPr>
+              <w:jc w:val="center"/>
+              <w:rPr>
+                <w:rFonts w:ascii="Arial" w:hAnsi="Arial" w:cs="Arial"/>
+                <w:sz w:val="22"/>
+                <w:szCs w:val="22"/>
+              </w:rPr>
+            </w:pPr>
+            <w:r>
+              <w:rPr>
+                <w:rFonts w:ascii="Arial" w:hAnsi="Arial" w:cs="Arial"/>
+                <w:sz w:val="22"/>
+                <w:szCs w:val="22"/>
+              </w:rPr>
+              <w:t>10</w:t>
+            </w:r>
+          </w:p>
+        </w:tc>
+        <w:tc>
+          <w:tcPr>
+            <w:tcW w:w="1500" w:type="dxa"/>
+            <w:tcBorders>
+              <w:top w:val="single" w:sz="6" w:space="0" w:color="000000"/>
+              <w:left w:val="single" w:sz="6" w:space="0" w:color="000000"/>
+              <w:bottom w:val="single" w:sz="6" w:space="0" w:color="000000"/>
+              <w:right w:val="single" w:sz="6" w:space="0" w:color="000000"/>
+            </w:tcBorders>
+            <w:tcMar>
+              <w:top w:w="80" w:type="dxa"/>
+              <w:left w:w="100" w:type="dxa"/>
+              <w:bottom w:w="80" w:type="dxa"/>
+              <w:right w:w="100" w:type="dxa"/>
+            </w:tcMar>
+            <w:vAlign w:val="center"/>
+          </w:tcPr>
+          <w:p>
+            <w:pPr>
+              <w:jc w:val="center"/>
+              <w:rPr>
+                <w:rFonts w:ascii="Arial" w:hAnsi="Arial" w:cs="Arial"/>
+                <w:sz w:val="22"/>
+                <w:szCs w:val="22"/>
+              </w:rPr>
+            </w:pPr>
+            <w:r>
+              <w:rPr>
+                <w:rFonts w:ascii="Arial" w:hAnsi="Arial" w:cs="Arial"/>
+                <w:sz w:val="22"/>
+                <w:szCs w:val="22"/>
+              </w:rPr>
+              <w:t>10</w:t>
+            </w:r>
           </w:p>
         </w:tc>
         <w:tc>
@@ -1532,12 +2045,25 @@
           <w:p>
             <w:pPr>
               <w:jc w:val="center"/>
+              <w:rPr>
+                <w:rFonts w:ascii="Arial" w:hAnsi="Arial" w:cs="Arial"/>
+                <w:sz w:val="22"/>
+                <w:szCs w:val="22"/>
+              </w:rPr>
             </w:pPr>
           </w:p>
         </w:tc>
       </w:tr>
     </w:tbl>
-    <w:p/>
+    <w:p>
+      <w:pPr>
+        <w:rPr>
+          <w:rFonts w:ascii="Arial" w:hAnsi="Arial" w:cs="Arial"/>
+          <w:sz w:val="22"/>
+          <w:szCs w:val="22"/>
+        </w:rPr>
+      </w:pPr>
+    </w:p>
     <w:sectPr>
       <w:pgSz w:w="15840" w:h="12240" w:orient="landscape"/>
       <w:pgMar w:top="1080" w:right="1080" w:bottom="1080" w:left="1080" w:header="708" w:footer="708" w:gutter="0"/>

</xml_diff>